<commit_message>
Add Phase 1 EDA + shared feature pipeline for LR/LGBM
Single sklearn pipeline produces the 9240 x 104 feature matrix that
Phase 2 will feed unchanged to both Logistic Regression (scale + OHE)
and LightGBM (missing-indicator flags recover MAR signal once impute
bypasses native NaN handling). Sharing one pipeline keeps the Phase 2
model comparison apples-to-apples.

Includes:
- src/lead_priority/features/ - derive, transformers, pipeline, load API
- scripts/fit_feature_pipeline.py - CLI producing joblib + summary JSON
- notebooks/1_eda_and_feature_engineering.ipynb - exploration walkthrough
- docs/1_eda_and_feature_engineering.docx - TR methodology + decisions
- tests/test_features_*.py - 16 derive/pipeline tests
</commit_message>
<xml_diff>
--- a/docs/0_synthetic_data_and_leakage.docx
+++ b/docs/0_synthetic_data_and_leakage.docx
@@ -2812,31 +2812,31 @@
       </w:rPr>
     </w:lvl>
   </w:abstractNum>
-  <w:num w:numId="1" w16cid:durableId="1953052870">
+  <w:num w:numId="1" w16cid:durableId="1343434899">
     <w:abstractNumId w:val="8"/>
   </w:num>
-  <w:num w:numId="2" w16cid:durableId="1012994949">
+  <w:num w:numId="2" w16cid:durableId="1161039895">
     <w:abstractNumId w:val="6"/>
   </w:num>
-  <w:num w:numId="3" w16cid:durableId="411705906">
+  <w:num w:numId="3" w16cid:durableId="1814179431">
     <w:abstractNumId w:val="5"/>
   </w:num>
-  <w:num w:numId="4" w16cid:durableId="590233977">
+  <w:num w:numId="4" w16cid:durableId="1620913760">
     <w:abstractNumId w:val="4"/>
   </w:num>
-  <w:num w:numId="5" w16cid:durableId="1012339950">
+  <w:num w:numId="5" w16cid:durableId="630523469">
     <w:abstractNumId w:val="7"/>
   </w:num>
-  <w:num w:numId="6" w16cid:durableId="874465248">
+  <w:num w:numId="6" w16cid:durableId="185480908">
     <w:abstractNumId w:val="3"/>
   </w:num>
-  <w:num w:numId="7" w16cid:durableId="1851213070">
+  <w:num w:numId="7" w16cid:durableId="215893608">
     <w:abstractNumId w:val="2"/>
   </w:num>
-  <w:num w:numId="8" w16cid:durableId="831917049">
+  <w:num w:numId="8" w16cid:durableId="589702911">
     <w:abstractNumId w:val="1"/>
   </w:num>
-  <w:num w:numId="9" w16cid:durableId="55249854">
+  <w:num w:numId="9" w16cid:durableId="2053845617">
     <w:abstractNumId w:val="0"/>
   </w:num>
 </w:numbering>

</xml_diff>

<commit_message>
Embed figures in Phase 0 and Phase 1 docx files
Retrofit charts into the earlier methodology docx files so all three phase
docs share the same visual treatment introduced in Phase 2.

- Phase 0 (3 figs): leakage single-column AUC bar (Tags/Lead Quality/Last
  Notable Activity vs. 0.5/0.7/0.85 thresholds), attitude class
  distribution, attitude × Converted heatmap with counts and row %
- Phase 1 (3 figs): Converted class distribution (38.5% positive),
  top-15 missing-data ratio bar ('Select' placeholder treated as NaN),
  pipeline output feature-kind breakdown over the 104-feature space
- Charts rendered by the local *docx.py builders (gitignored) and saved
  to artifacts/figures/{0,1}_*.png with concise italic captions
</commit_message>
<xml_diff>
--- a/docs/0_synthetic_data_and_leakage.docx
+++ b/docs/0_synthetic_data_and_leakage.docx
@@ -26,15 +26,15 @@
     <w:p>
       <w:pPr>
         <w:rPr>
-          <w:sz w:val="18"/>
-          <w:szCs w:val="18"/>
+          <w:sz w:val="16"/>
+          <w:szCs w:val="16"/>
         </w:rPr>
       </w:pPr>
       <w:hyperlink w:anchor="h_1_strateji_ve_gerekce">
         <w:r>
           <w:rPr>
-            <w:sz w:val="18"/>
-            <w:szCs w:val="18"/>
+            <w:sz w:val="16"/>
+            <w:szCs w:val="16"/>
           </w:rPr>
           <w:t>1. Strateji ve gerekçe</w:t>
         </w:r>
@@ -43,15 +43,15 @@
     <w:p>
       <w:pPr>
         <w:rPr>
-          <w:sz w:val="18"/>
-          <w:szCs w:val="18"/>
+          <w:sz w:val="16"/>
+          <w:szCs w:val="16"/>
         </w:rPr>
       </w:pPr>
       <w:hyperlink w:anchor="h_2_attitude_gizli_ground_truth_nasil_turetildi">
         <w:r>
           <w:rPr>
-            <w:sz w:val="18"/>
-            <w:szCs w:val="18"/>
+            <w:sz w:val="16"/>
+            <w:szCs w:val="16"/>
           </w:rPr>
           <w:t>2. Attitude (gizli ground-truth) nasıl türetildi?</w:t>
         </w:r>
@@ -61,15 +61,15 @@
       <w:pPr>
         <w:ind w:left="360"/>
         <w:rPr>
-          <w:sz w:val="18"/>
-          <w:szCs w:val="18"/>
+          <w:sz w:val="16"/>
+          <w:szCs w:val="16"/>
         </w:rPr>
       </w:pPr>
       <w:hyperlink w:anchor="h_2_1_ilgi_puani_engagement_nasil_hesaplandi">
         <w:r>
           <w:rPr>
-            <w:sz w:val="18"/>
-            <w:szCs w:val="18"/>
+            <w:sz w:val="16"/>
+            <w:szCs w:val="16"/>
           </w:rPr>
           <w:t>2.1 'İlgi puanı' (engagement) nasıl hesaplandı?</w:t>
         </w:r>
@@ -79,15 +79,15 @@
       <w:pPr>
         <w:ind w:left="360"/>
         <w:rPr>
-          <w:sz w:val="18"/>
-          <w:szCs w:val="18"/>
+          <w:sz w:val="16"/>
+          <w:szCs w:val="16"/>
         </w:rPr>
       </w:pPr>
       <w:hyperlink w:anchor="h_2_2_neden_rastgele_sapma_eklendi">
         <w:r>
           <w:rPr>
-            <w:sz w:val="18"/>
-            <w:szCs w:val="18"/>
+            <w:sz w:val="16"/>
+            <w:szCs w:val="16"/>
           </w:rPr>
           <w:t>2.2 Neden rastgele sapma eklendi?</w:t>
         </w:r>
@@ -97,15 +97,15 @@
       <w:pPr>
         <w:ind w:left="360"/>
         <w:rPr>
-          <w:sz w:val="18"/>
-          <w:szCs w:val="18"/>
+          <w:sz w:val="16"/>
+          <w:szCs w:val="16"/>
         </w:rPr>
       </w:pPr>
       <w:hyperlink w:anchor="h_2_3_ilgi_puanindan_4_sinifa_nasil_gidiliyor">
         <w:r>
           <w:rPr>
-            <w:sz w:val="18"/>
-            <w:szCs w:val="18"/>
+            <w:sz w:val="16"/>
+            <w:szCs w:val="16"/>
           </w:rPr>
           <w:t>2.3 İlgi puanından 4 sınıfa nasıl gidiliyor?</w:t>
         </w:r>
@@ -115,15 +115,15 @@
       <w:pPr>
         <w:ind w:left="360"/>
         <w:rPr>
-          <w:sz w:val="18"/>
-          <w:szCs w:val="18"/>
+          <w:sz w:val="16"/>
+          <w:szCs w:val="16"/>
         </w:rPr>
       </w:pPr>
       <w:hyperlink w:anchor="h_2_4_engagement_ve_friction_cikti_dosyasina_yazilmaz_gerekce">
         <w:r>
           <w:rPr>
-            <w:sz w:val="18"/>
-            <w:szCs w:val="18"/>
+            <w:sz w:val="16"/>
+            <w:szCs w:val="16"/>
           </w:rPr>
           <w:t>2.4 Engagement ve friction çıktı dosyasına yazılmaz — gerekçe</w:t>
         </w:r>
@@ -132,15 +132,15 @@
     <w:p>
       <w:pPr>
         <w:rPr>
-          <w:sz w:val="18"/>
-          <w:szCs w:val="18"/>
+          <w:sz w:val="16"/>
+          <w:szCs w:val="16"/>
         </w:rPr>
       </w:pPr>
       <w:hyperlink w:anchor="h_3_veri_sizintisi_leakage_kavram_iki_cephe_onlemler">
         <w:r>
           <w:rPr>
-            <w:sz w:val="18"/>
-            <w:szCs w:val="18"/>
+            <w:sz w:val="16"/>
+            <w:szCs w:val="16"/>
           </w:rPr>
           <w:t>3. Veri sızıntısı (leakage): kavram + iki cephe + önlemler</w:t>
         </w:r>
@@ -150,15 +150,15 @@
       <w:pPr>
         <w:ind w:left="360"/>
         <w:rPr>
-          <w:sz w:val="18"/>
-          <w:szCs w:val="18"/>
+          <w:sz w:val="16"/>
+          <w:szCs w:val="16"/>
         </w:rPr>
       </w:pPr>
       <w:hyperlink w:anchor="h_3_1_cephe_1_sentetik_uretim_asamasi">
         <w:r>
           <w:rPr>
-            <w:sz w:val="18"/>
-            <w:szCs w:val="18"/>
+            <w:sz w:val="16"/>
+            <w:szCs w:val="16"/>
           </w:rPr>
           <w:t>3.1 Cephe 1: sentetik üretim aşaması</w:t>
         </w:r>
@@ -168,15 +168,15 @@
       <w:pPr>
         <w:ind w:left="360"/>
         <w:rPr>
-          <w:sz w:val="18"/>
-          <w:szCs w:val="18"/>
+          <w:sz w:val="16"/>
+          <w:szCs w:val="16"/>
         </w:rPr>
       </w:pPr>
       <w:hyperlink w:anchor="h_3_2_cephe_2_ham_tabular_verideki_leakage_adaylari">
         <w:r>
           <w:rPr>
-            <w:sz w:val="18"/>
-            <w:szCs w:val="18"/>
+            <w:sz w:val="16"/>
+            <w:szCs w:val="16"/>
           </w:rPr>
           <w:t>3.2 Cephe 2: ham tabular verideki leakage adayları</w:t>
         </w:r>
@@ -185,15 +185,15 @@
     <w:p>
       <w:pPr>
         <w:rPr>
-          <w:sz w:val="18"/>
-          <w:szCs w:val="18"/>
+          <w:sz w:val="16"/>
+          <w:szCs w:val="16"/>
         </w:rPr>
       </w:pPr>
       <w:hyperlink w:anchor="h_4_metriklerin_tanimlari_ve_hesaplama_yontemi">
         <w:r>
           <w:rPr>
-            <w:sz w:val="18"/>
-            <w:szCs w:val="18"/>
+            <w:sz w:val="16"/>
+            <w:szCs w:val="16"/>
           </w:rPr>
           <w:t>4. Metriklerin tanımları ve hesaplama yöntemi</w:t>
         </w:r>
@@ -203,15 +203,15 @@
       <w:pPr>
         <w:ind w:left="360"/>
         <w:rPr>
-          <w:sz w:val="18"/>
-          <w:szCs w:val="18"/>
+          <w:sz w:val="16"/>
+          <w:szCs w:val="16"/>
         </w:rPr>
       </w:pPr>
       <w:hyperlink w:anchor="h_4_1_attitude_converted_auc_5_fold_lr">
         <w:r>
           <w:rPr>
-            <w:sz w:val="18"/>
-            <w:szCs w:val="18"/>
+            <w:sz w:val="16"/>
+            <w:szCs w:val="16"/>
           </w:rPr>
           <w:t>4.1 attitude → Converted AUC (5-fold LR)</w:t>
         </w:r>
@@ -221,15 +221,15 @@
       <w:pPr>
         <w:ind w:left="360"/>
         <w:rPr>
-          <w:sz w:val="18"/>
-          <w:szCs w:val="18"/>
+          <w:sz w:val="16"/>
+          <w:szCs w:val="16"/>
         </w:rPr>
       </w:pPr>
       <w:hyperlink w:anchor="h_4_2_cram_r_s_v_attitude_converted">
         <w:r>
           <w:rPr>
-            <w:sz w:val="18"/>
-            <w:szCs w:val="18"/>
+            <w:sz w:val="16"/>
+            <w:szCs w:val="16"/>
           </w:rPr>
           <w:t>4.2 Cramér's V (attitude × Converted)</w:t>
         </w:r>
@@ -239,15 +239,15 @@
       <w:pPr>
         <w:ind w:left="360"/>
         <w:rPr>
-          <w:sz w:val="18"/>
-          <w:szCs w:val="18"/>
+          <w:sz w:val="16"/>
+          <w:szCs w:val="16"/>
         </w:rPr>
       </w:pPr>
       <w:hyperlink w:anchor="h_4_3_mutual_information_nats">
         <w:r>
           <w:rPr>
-            <w:sz w:val="18"/>
-            <w:szCs w:val="18"/>
+            <w:sz w:val="16"/>
+            <w:szCs w:val="16"/>
           </w:rPr>
           <w:t>4.3 Mutual Information (nats)</w:t>
         </w:r>
@@ -257,15 +257,15 @@
       <w:pPr>
         <w:ind w:left="360"/>
         <w:rPr>
-          <w:sz w:val="18"/>
-          <w:szCs w:val="18"/>
+          <w:sz w:val="16"/>
+          <w:szCs w:val="16"/>
         </w:rPr>
       </w:pPr>
       <w:hyperlink w:anchor="h_4_4_tabular_suspect_tek_kolon_auc_cv_yok">
         <w:r>
           <w:rPr>
-            <w:sz w:val="18"/>
-            <w:szCs w:val="18"/>
+            <w:sz w:val="16"/>
+            <w:szCs w:val="16"/>
           </w:rPr>
           <w:t>4.4 Tabular suspect tek-kolon AUC (CV yok)</w:t>
         </w:r>
@@ -274,15 +274,15 @@
     <w:p>
       <w:pPr>
         <w:rPr>
-          <w:sz w:val="18"/>
-          <w:szCs w:val="18"/>
+          <w:sz w:val="16"/>
+          <w:szCs w:val="16"/>
         </w:rPr>
       </w:pPr>
       <w:hyperlink w:anchor="h_5_sayisal_dogrulama_sonuclar">
         <w:r>
           <w:rPr>
-            <w:sz w:val="18"/>
-            <w:szCs w:val="18"/>
+            <w:sz w:val="16"/>
+            <w:szCs w:val="16"/>
           </w:rPr>
           <w:t>5. Sayısal doğrulama (sonuçlar)</w:t>
         </w:r>
@@ -292,15 +292,15 @@
       <w:pPr>
         <w:ind w:left="360"/>
         <w:rPr>
-          <w:sz w:val="18"/>
-          <w:szCs w:val="18"/>
+          <w:sz w:val="16"/>
+          <w:szCs w:val="16"/>
         </w:rPr>
       </w:pPr>
       <w:hyperlink w:anchor="h_crosstab_attitude_converted">
         <w:r>
           <w:rPr>
-            <w:sz w:val="18"/>
-            <w:szCs w:val="18"/>
+            <w:sz w:val="16"/>
+            <w:szCs w:val="16"/>
           </w:rPr>
           <w:t>Crosstab: attitude × Converted</w:t>
         </w:r>
@@ -310,15 +310,15 @@
       <w:pPr>
         <w:ind w:left="360"/>
         <w:rPr>
-          <w:sz w:val="18"/>
-          <w:szCs w:val="18"/>
+          <w:sz w:val="16"/>
+          <w:szCs w:val="16"/>
         </w:rPr>
       </w:pPr>
       <w:hyperlink w:anchor="h_tabular_leakage_adaylari">
         <w:r>
           <w:rPr>
-            <w:sz w:val="18"/>
-            <w:szCs w:val="18"/>
+            <w:sz w:val="16"/>
+            <w:szCs w:val="16"/>
           </w:rPr>
           <w:t>Tabular leakage adayları</w:t>
         </w:r>
@@ -328,15 +328,15 @@
       <w:pPr>
         <w:ind w:left="360"/>
         <w:rPr>
-          <w:sz w:val="18"/>
-          <w:szCs w:val="18"/>
+          <w:sz w:val="16"/>
+          <w:szCs w:val="16"/>
         </w:rPr>
       </w:pPr>
       <w:hyperlink w:anchor="h_otomatik_yorum_ozet">
         <w:r>
           <w:rPr>
-            <w:sz w:val="18"/>
-            <w:szCs w:val="18"/>
+            <w:sz w:val="16"/>
+            <w:szCs w:val="16"/>
           </w:rPr>
           <w:t>Otomatik yorum (özet)</w:t>
         </w:r>
@@ -345,15 +345,15 @@
     <w:p>
       <w:pPr>
         <w:rPr>
-          <w:sz w:val="18"/>
-          <w:szCs w:val="18"/>
+          <w:sz w:val="16"/>
+          <w:szCs w:val="16"/>
         </w:rPr>
       </w:pPr>
       <w:hyperlink w:anchor="h_6_kod_organizasyonu">
         <w:r>
           <w:rPr>
-            <w:sz w:val="18"/>
-            <w:szCs w:val="18"/>
+            <w:sz w:val="16"/>
+            <w:szCs w:val="16"/>
           </w:rPr>
           <w:t>6. Kod organizasyonu</w:t>
         </w:r>
@@ -362,15 +362,15 @@
     <w:p>
       <w:pPr>
         <w:rPr>
-          <w:sz w:val="18"/>
-          <w:szCs w:val="18"/>
+          <w:sz w:val="16"/>
+          <w:szCs w:val="16"/>
         </w:rPr>
       </w:pPr>
       <w:hyperlink w:anchor="h_7_sinirlamalar_ve_daha_cok_zaman_olsa">
         <w:r>
           <w:rPr>
-            <w:sz w:val="18"/>
-            <w:szCs w:val="18"/>
+            <w:sz w:val="16"/>
+            <w:szCs w:val="16"/>
           </w:rPr>
           <w:t>7. Sınırlamalar ve daha çok zaman olsa…</w:t>
         </w:r>
@@ -803,11 +803,68 @@
     </w:p>
     <w:p>
       <w:pPr>
+        <w:jc w:val="center"/>
+      </w:pPr>
+      <w:r>
+        <w:rPr>
+          <w:noProof/>
+        </w:rPr>
+        <w:lastRenderedPageBreak/>
+        <w:drawing>
+          <wp:inline distT="0" distB="0" distL="0" distR="0" wp14:anchorId="6EADDA70" wp14:editId="1EA1E6F6">
+            <wp:extent cx="5303520" cy="3379810"/>
+            <wp:effectExtent l="0" t="0" r="0" b="0"/>
+            <wp:docPr id="1" name="Picture 1"/>
+            <wp:cNvGraphicFramePr>
+              <a:graphicFrameLocks xmlns:a="http://schemas.openxmlformats.org/drawingml/2006/main" noChangeAspect="1"/>
+            </wp:cNvGraphicFramePr>
+            <a:graphic xmlns:a="http://schemas.openxmlformats.org/drawingml/2006/main">
+              <a:graphicData uri="http://schemas.openxmlformats.org/drawingml/2006/picture">
+                <pic:pic xmlns:pic="http://schemas.openxmlformats.org/drawingml/2006/picture">
+                  <pic:nvPicPr>
+                    <pic:cNvPr id="0" name="0_attitude_distribution.png"/>
+                    <pic:cNvPicPr/>
+                  </pic:nvPicPr>
+                  <pic:blipFill>
+                    <a:blip r:embed="rId6"/>
+                    <a:stretch>
+                      <a:fillRect/>
+                    </a:stretch>
+                  </pic:blipFill>
+                  <pic:spPr>
+                    <a:xfrm>
+                      <a:off x="0" y="0"/>
+                      <a:ext cx="5303520" cy="3379810"/>
+                    </a:xfrm>
+                    <a:prstGeom prst="rect">
+                      <a:avLst/>
+                    </a:prstGeom>
+                  </pic:spPr>
+                </pic:pic>
+              </a:graphicData>
+            </a:graphic>
+          </wp:inline>
+        </w:drawing>
+      </w:r>
+    </w:p>
+    <w:p>
+      <w:pPr>
+        <w:jc w:val="center"/>
+      </w:pPr>
+      <w:r>
+        <w:rPr>
+          <w:i/>
+          <w:sz w:val="20"/>
+        </w:rPr>
+        <w:t>Şekil 1 — 9.240 lead için üretilen sentetik attitude (gizli ground-truth) dağılımı. Dört sınıf engagement + friction kombinasyonundan elde edilir; gerçek dünyaya benzer eğri ama dengeli bir bant aralığı sağlar.</w:t>
+      </w:r>
+    </w:p>
+    <w:p>
+      <w:pPr>
         <w:pStyle w:val="Heading2"/>
       </w:pPr>
       <w:bookmarkStart w:id="5" w:name="h_2_4_engagement_ve_friction_cikti_dosya"/>
       <w:r>
-        <w:lastRenderedPageBreak/>
         <w:t>2.4 Engagement ve friction çıktı dosyasına yazılmaz — gerekçe</w:t>
       </w:r>
       <w:bookmarkEnd w:id="5"/>
@@ -857,6 +914,7 @@
       </w:pPr>
       <w:bookmarkStart w:id="6" w:name="h_3_veri_sizintisi_leakage_kavram_iki_ce"/>
       <w:r>
+        <w:lastRenderedPageBreak/>
         <w:t>3. Veri sızıntısı (leakage): kavram + iki cephe + önlemler</w:t>
       </w:r>
       <w:bookmarkEnd w:id="6"/>
@@ -879,136 +937,11 @@
         <w:pStyle w:val="ListBullet"/>
       </w:pPr>
       <w:r>
-        <w:t xml:space="preserve">Temporal leakage — tahmin anında henüz oluşmamış bilgi. Örn. 'müşteri oldu, sözleşmeyi imzaladı' diye yazılmış bir CRM notu: not bilgisi outcome'tan SONRA geliyor; yeni bir lead </w:t>
-      </w:r>
-      <w:proofErr w:type="spellStart"/>
-      <w:r>
-        <w:t>için</w:t>
-      </w:r>
-      <w:proofErr w:type="spellEnd"/>
-      <w:r>
-        <w:t xml:space="preserve"> </w:t>
-      </w:r>
-      <w:proofErr w:type="spellStart"/>
-      <w:r>
-        <w:t>bunu</w:t>
-      </w:r>
-      <w:proofErr w:type="spellEnd"/>
-      <w:r>
-        <w:t xml:space="preserve"> </w:t>
-      </w:r>
-      <w:proofErr w:type="spellStart"/>
-      <w:r>
-        <w:t>üretemeyiz</w:t>
-      </w:r>
-      <w:proofErr w:type="spellEnd"/>
-      <w:r>
-        <w:t>.</w:t>
+        <w:t>Temporal leakage — tahmin anında henüz oluşmamış bilgi. Örn. 'müşteri oldu, sözleşmeyi imzaladı' diye yazılmış bir CRM notu: not bilgisi outcome'tan SONRA geliyor; yeni bir lead için bunu üretemeyiz.</w:t>
       </w:r>
     </w:p>
     <w:p>
-      <w:pPr>
-        <w:pStyle w:val="ListBullet"/>
-        <w:numPr>
-          <w:ilvl w:val="0"/>
-          <w:numId w:val="0"/>
-        </w:numPr>
-        <w:ind w:left="360" w:hanging="360"/>
-      </w:pPr>
-    </w:p>
-    <w:p>
-      <w:pPr>
-        <w:pStyle w:val="ListBullet"/>
-        <w:numPr>
-          <w:ilvl w:val="0"/>
-          <w:numId w:val="0"/>
-        </w:numPr>
-        <w:ind w:left="360" w:hanging="360"/>
-      </w:pPr>
-    </w:p>
-    <w:p>
-      <w:pPr>
-        <w:pStyle w:val="ListBullet"/>
-        <w:numPr>
-          <w:ilvl w:val="0"/>
-          <w:numId w:val="0"/>
-        </w:numPr>
-        <w:ind w:left="360" w:hanging="360"/>
-      </w:pPr>
-    </w:p>
-    <w:p>
-      <w:pPr>
-        <w:pStyle w:val="ListBullet"/>
-        <w:numPr>
-          <w:ilvl w:val="0"/>
-          <w:numId w:val="0"/>
-        </w:numPr>
-        <w:ind w:left="360" w:hanging="360"/>
-      </w:pPr>
-    </w:p>
-    <w:p>
-      <w:pPr>
-        <w:pStyle w:val="ListBullet"/>
-        <w:numPr>
-          <w:ilvl w:val="0"/>
-          <w:numId w:val="0"/>
-        </w:numPr>
-        <w:ind w:left="360" w:hanging="360"/>
-      </w:pPr>
-    </w:p>
-    <w:p>
-      <w:pPr>
-        <w:pStyle w:val="ListBullet"/>
-        <w:numPr>
-          <w:ilvl w:val="0"/>
-          <w:numId w:val="0"/>
-        </w:numPr>
-        <w:ind w:left="360" w:hanging="360"/>
-      </w:pPr>
-    </w:p>
-    <w:p>
-      <w:pPr>
-        <w:pStyle w:val="ListBullet"/>
-        <w:numPr>
-          <w:ilvl w:val="0"/>
-          <w:numId w:val="0"/>
-        </w:numPr>
-        <w:ind w:left="360" w:hanging="360"/>
-      </w:pPr>
-    </w:p>
-    <w:p>
-      <w:pPr>
-        <w:pStyle w:val="ListBullet"/>
-        <w:numPr>
-          <w:ilvl w:val="0"/>
-          <w:numId w:val="0"/>
-        </w:numPr>
-        <w:ind w:left="360" w:hanging="360"/>
-      </w:pPr>
-    </w:p>
-    <w:p>
-      <w:pPr>
-        <w:pStyle w:val="ListBullet"/>
-        <w:numPr>
-          <w:ilvl w:val="0"/>
-          <w:numId w:val="0"/>
-        </w:numPr>
-        <w:ind w:left="360" w:hanging="360"/>
-      </w:pPr>
-    </w:p>
-    <w:p>
-      <w:pPr>
-        <w:pStyle w:val="ListBullet"/>
-        <w:numPr>
-          <w:ilvl w:val="0"/>
-          <w:numId w:val="0"/>
-        </w:numPr>
-        <w:ind w:left="360" w:hanging="360"/>
-      </w:pPr>
-    </w:p>
-    <w:p>
       <w:r>
-        <w:lastRenderedPageBreak/>
         <w:t>Bu projede leakage iki ayrı yerden gelebilir; ikisini birlikte ele almak zorunludur:</w:t>
       </w:r>
     </w:p>
@@ -1213,6 +1146,7 @@
         <w:pStyle w:val="ListBullet"/>
       </w:pPr>
       <w:r>
+        <w:lastRenderedPageBreak/>
         <w:t>Tüm rastgelelik tek bir RNG (seed=42) üzerinden — sonuçlar tekrarlanabilir.</w:t>
       </w:r>
     </w:p>
@@ -1252,7 +1186,6 @@
       </w:pPr>
       <w:bookmarkStart w:id="10" w:name="h_4_1_attitude_converted_auc_5_fold_lr"/>
       <w:r>
-        <w:lastRenderedPageBreak/>
         <w:t>4.1 attitude → Converted AUC (5-fold LR)</w:t>
       </w:r>
       <w:bookmarkEnd w:id="10"/>
@@ -1356,6 +1289,7 @@
     </w:p>
     <w:p>
       <w:r>
+        <w:lastRenderedPageBreak/>
         <w:t>Kod: datagen.leakage.cramers_v</w:t>
       </w:r>
     </w:p>
@@ -1399,7 +1333,6 @@
         <w:pStyle w:val="ListBullet"/>
       </w:pPr>
       <w:r>
-        <w:lastRenderedPageBreak/>
         <w:t>Kolon string'e dönüştürülür; NaN'lar 'Missing' olarak işaretlenir.</w:t>
       </w:r>
     </w:p>
@@ -2022,6 +1955,64 @@
     </w:tbl>
     <w:p>
       <w:pPr>
+        <w:jc w:val="center"/>
+      </w:pPr>
+      <w:r>
+        <w:rPr>
+          <w:noProof/>
+        </w:rPr>
+        <w:lastRenderedPageBreak/>
+        <w:drawing>
+          <wp:inline distT="0" distB="0" distL="0" distR="0" wp14:anchorId="442630FA" wp14:editId="0831B6D9">
+            <wp:extent cx="5303520" cy="3752714"/>
+            <wp:effectExtent l="0" t="0" r="0" b="0"/>
+            <wp:docPr id="2" name="Picture 2"/>
+            <wp:cNvGraphicFramePr>
+              <a:graphicFrameLocks xmlns:a="http://schemas.openxmlformats.org/drawingml/2006/main" noChangeAspect="1"/>
+            </wp:cNvGraphicFramePr>
+            <a:graphic xmlns:a="http://schemas.openxmlformats.org/drawingml/2006/main">
+              <a:graphicData uri="http://schemas.openxmlformats.org/drawingml/2006/picture">
+                <pic:pic xmlns:pic="http://schemas.openxmlformats.org/drawingml/2006/picture">
+                  <pic:nvPicPr>
+                    <pic:cNvPr id="0" name="0_attitude_crosstab.png"/>
+                    <pic:cNvPicPr/>
+                  </pic:nvPicPr>
+                  <pic:blipFill>
+                    <a:blip r:embed="rId7"/>
+                    <a:stretch>
+                      <a:fillRect/>
+                    </a:stretch>
+                  </pic:blipFill>
+                  <pic:spPr>
+                    <a:xfrm>
+                      <a:off x="0" y="0"/>
+                      <a:ext cx="5303520" cy="3752714"/>
+                    </a:xfrm>
+                    <a:prstGeom prst="rect">
+                      <a:avLst/>
+                    </a:prstGeom>
+                  </pic:spPr>
+                </pic:pic>
+              </a:graphicData>
+            </a:graphic>
+          </wp:inline>
+        </w:drawing>
+      </w:r>
+    </w:p>
+    <w:p>
+      <w:pPr>
+        <w:jc w:val="center"/>
+      </w:pPr>
+      <w:r>
+        <w:rPr>
+          <w:i/>
+          <w:sz w:val="20"/>
+        </w:rPr>
+        <w:t>Şekil 2 — attitude × Converted heatmap. positive_engagement lead'lerinin %75'i dönüşmüş; objection sınıfının %53'ü yine de dönüştüğü için attitude tek başına perfect leakage değil — gerçek hayata uygun gürültü içeriyor.</w:t>
+      </w:r>
+    </w:p>
+    <w:p>
+      <w:pPr>
         <w:pStyle w:val="Heading2"/>
       </w:pPr>
       <w:bookmarkStart w:id="16" w:name="h_tabular_leakage_adaylari"/>
@@ -2282,6 +2273,64 @@
     </w:tbl>
     <w:p>
       <w:pPr>
+        <w:jc w:val="center"/>
+      </w:pPr>
+      <w:r>
+        <w:rPr>
+          <w:noProof/>
+        </w:rPr>
+        <w:lastRenderedPageBreak/>
+        <w:drawing>
+          <wp:inline distT="0" distB="0" distL="0" distR="0" wp14:anchorId="76405601" wp14:editId="1D3066E4">
+            <wp:extent cx="5303520" cy="3140169"/>
+            <wp:effectExtent l="0" t="0" r="0" b="0"/>
+            <wp:docPr id="3" name="Picture 3"/>
+            <wp:cNvGraphicFramePr>
+              <a:graphicFrameLocks xmlns:a="http://schemas.openxmlformats.org/drawingml/2006/main" noChangeAspect="1"/>
+            </wp:cNvGraphicFramePr>
+            <a:graphic xmlns:a="http://schemas.openxmlformats.org/drawingml/2006/main">
+              <a:graphicData uri="http://schemas.openxmlformats.org/drawingml/2006/picture">
+                <pic:pic xmlns:pic="http://schemas.openxmlformats.org/drawingml/2006/picture">
+                  <pic:nvPicPr>
+                    <pic:cNvPr id="0" name="0_leakage_auc.png"/>
+                    <pic:cNvPicPr/>
+                  </pic:nvPicPr>
+                  <pic:blipFill>
+                    <a:blip r:embed="rId8"/>
+                    <a:stretch>
+                      <a:fillRect/>
+                    </a:stretch>
+                  </pic:blipFill>
+                  <pic:spPr>
+                    <a:xfrm>
+                      <a:off x="0" y="0"/>
+                      <a:ext cx="5303520" cy="3140169"/>
+                    </a:xfrm>
+                    <a:prstGeom prst="rect">
+                      <a:avLst/>
+                    </a:prstGeom>
+                  </pic:spPr>
+                </pic:pic>
+              </a:graphicData>
+            </a:graphic>
+          </wp:inline>
+        </w:drawing>
+      </w:r>
+    </w:p>
+    <w:p>
+      <w:pPr>
+        <w:jc w:val="center"/>
+      </w:pPr>
+      <w:r>
+        <w:rPr>
+          <w:i/>
+          <w:sz w:val="20"/>
+        </w:rPr>
+        <w:t>Şekil 3 — Tabular leakage adaylarının tek-kolon AUC değerleri. Tags 0.92 ile açık leakage bandında, Lead Quality 0.80 ile şüphe bandında, Last Notable Activity 0.70 sınırda. Üçü de Phase 1 feature setinden drop edildi.</w:t>
+      </w:r>
+    </w:p>
+    <w:p>
+      <w:pPr>
         <w:pStyle w:val="Heading2"/>
       </w:pPr>
       <w:bookmarkStart w:id="17" w:name="h_otomatik_yorum_ozet"/>
@@ -2311,8 +2360,154 @@
         <w:pStyle w:val="ListBullet"/>
       </w:pPr>
       <w:r>
-        <w:t>⚠️ Tabular sızıntı adayı 'Tags' tek-kolon AUC=0.9227: scoring modelinde DROP edilmeli.</w:t>
+        <w:t xml:space="preserve">⚠️ Tabular sızıntı adayı 'Tags' tek-kolon AUC=0.9227: scoring </w:t>
       </w:r>
+      <w:proofErr w:type="spellStart"/>
+      <w:r>
+        <w:t>modelinde</w:t>
+      </w:r>
+      <w:proofErr w:type="spellEnd"/>
+      <w:r>
+        <w:t xml:space="preserve"> DROP </w:t>
+      </w:r>
+      <w:proofErr w:type="spellStart"/>
+      <w:r>
+        <w:t>edilmeli</w:t>
+      </w:r>
+      <w:proofErr w:type="spellEnd"/>
+      <w:r>
+        <w:t>.</w:t>
+      </w:r>
+    </w:p>
+    <w:p>
+      <w:pPr>
+        <w:pStyle w:val="ListBullet"/>
+        <w:numPr>
+          <w:ilvl w:val="0"/>
+          <w:numId w:val="0"/>
+        </w:numPr>
+        <w:ind w:left="360" w:hanging="360"/>
+      </w:pPr>
+    </w:p>
+    <w:p>
+      <w:pPr>
+        <w:pStyle w:val="ListBullet"/>
+        <w:numPr>
+          <w:ilvl w:val="0"/>
+          <w:numId w:val="0"/>
+        </w:numPr>
+        <w:ind w:left="360" w:hanging="360"/>
+      </w:pPr>
+    </w:p>
+    <w:p>
+      <w:pPr>
+        <w:pStyle w:val="ListBullet"/>
+        <w:numPr>
+          <w:ilvl w:val="0"/>
+          <w:numId w:val="0"/>
+        </w:numPr>
+        <w:ind w:left="360" w:hanging="360"/>
+      </w:pPr>
+    </w:p>
+    <w:p>
+      <w:pPr>
+        <w:pStyle w:val="ListBullet"/>
+        <w:numPr>
+          <w:ilvl w:val="0"/>
+          <w:numId w:val="0"/>
+        </w:numPr>
+        <w:ind w:left="360" w:hanging="360"/>
+      </w:pPr>
+    </w:p>
+    <w:p>
+      <w:pPr>
+        <w:pStyle w:val="ListBullet"/>
+        <w:numPr>
+          <w:ilvl w:val="0"/>
+          <w:numId w:val="0"/>
+        </w:numPr>
+        <w:ind w:left="360" w:hanging="360"/>
+      </w:pPr>
+    </w:p>
+    <w:p>
+      <w:pPr>
+        <w:pStyle w:val="ListBullet"/>
+        <w:numPr>
+          <w:ilvl w:val="0"/>
+          <w:numId w:val="0"/>
+        </w:numPr>
+        <w:ind w:left="360" w:hanging="360"/>
+      </w:pPr>
+    </w:p>
+    <w:p>
+      <w:pPr>
+        <w:pStyle w:val="ListBullet"/>
+        <w:numPr>
+          <w:ilvl w:val="0"/>
+          <w:numId w:val="0"/>
+        </w:numPr>
+        <w:ind w:left="360" w:hanging="360"/>
+      </w:pPr>
+    </w:p>
+    <w:p>
+      <w:pPr>
+        <w:pStyle w:val="ListBullet"/>
+        <w:numPr>
+          <w:ilvl w:val="0"/>
+          <w:numId w:val="0"/>
+        </w:numPr>
+        <w:ind w:left="360" w:hanging="360"/>
+      </w:pPr>
+    </w:p>
+    <w:p>
+      <w:pPr>
+        <w:pStyle w:val="ListBullet"/>
+        <w:numPr>
+          <w:ilvl w:val="0"/>
+          <w:numId w:val="0"/>
+        </w:numPr>
+        <w:ind w:left="360" w:hanging="360"/>
+      </w:pPr>
+    </w:p>
+    <w:p>
+      <w:pPr>
+        <w:pStyle w:val="ListBullet"/>
+        <w:numPr>
+          <w:ilvl w:val="0"/>
+          <w:numId w:val="0"/>
+        </w:numPr>
+        <w:ind w:left="360" w:hanging="360"/>
+      </w:pPr>
+    </w:p>
+    <w:p>
+      <w:pPr>
+        <w:pStyle w:val="ListBullet"/>
+        <w:numPr>
+          <w:ilvl w:val="0"/>
+          <w:numId w:val="0"/>
+        </w:numPr>
+        <w:ind w:left="360" w:hanging="360"/>
+      </w:pPr>
+    </w:p>
+    <w:p>
+      <w:pPr>
+        <w:pStyle w:val="ListBullet"/>
+        <w:numPr>
+          <w:ilvl w:val="0"/>
+          <w:numId w:val="0"/>
+        </w:numPr>
+        <w:ind w:left="360" w:hanging="360"/>
+      </w:pPr>
+    </w:p>
+    <w:p>
+      <w:pPr>
+        <w:pStyle w:val="ListBullet"/>
+        <w:numPr>
+          <w:ilvl w:val="0"/>
+          <w:numId w:val="0"/>
+        </w:numPr>
+        <w:ind w:left="360" w:hanging="360"/>
+      </w:pPr>
     </w:p>
     <w:p>
       <w:pPr>
@@ -2812,31 +3007,31 @@
       </w:rPr>
     </w:lvl>
   </w:abstractNum>
-  <w:num w:numId="1" w16cid:durableId="1343434899">
+  <w:num w:numId="1" w16cid:durableId="849569583">
     <w:abstractNumId w:val="8"/>
   </w:num>
-  <w:num w:numId="2" w16cid:durableId="1161039895">
+  <w:num w:numId="2" w16cid:durableId="841895823">
     <w:abstractNumId w:val="6"/>
   </w:num>
-  <w:num w:numId="3" w16cid:durableId="1814179431">
+  <w:num w:numId="3" w16cid:durableId="651376307">
     <w:abstractNumId w:val="5"/>
   </w:num>
-  <w:num w:numId="4" w16cid:durableId="1620913760">
+  <w:num w:numId="4" w16cid:durableId="654382439">
     <w:abstractNumId w:val="4"/>
   </w:num>
-  <w:num w:numId="5" w16cid:durableId="630523469">
+  <w:num w:numId="5" w16cid:durableId="322510464">
     <w:abstractNumId w:val="7"/>
   </w:num>
-  <w:num w:numId="6" w16cid:durableId="185480908">
+  <w:num w:numId="6" w16cid:durableId="8063486">
     <w:abstractNumId w:val="3"/>
   </w:num>
-  <w:num w:numId="7" w16cid:durableId="215893608">
+  <w:num w:numId="7" w16cid:durableId="1794709202">
     <w:abstractNumId w:val="2"/>
   </w:num>
-  <w:num w:numId="8" w16cid:durableId="589702911">
+  <w:num w:numId="8" w16cid:durableId="1273779555">
     <w:abstractNumId w:val="1"/>
   </w:num>
-  <w:num w:numId="9" w16cid:durableId="2053845617">
+  <w:num w:numId="9" w16cid:durableId="969868975">
     <w:abstractNumId w:val="0"/>
   </w:num>
 </w:numbering>

</xml_diff>